<commit_message>
docs: citas por aprobar y pacientes sin login (decisión 24)
Alcance, contrato de la API, modelo de datos y diagrama entidad-relación,
manuales técnico, de instalación (migración 003) y de usuario. Word regenerados.
</commit_message>
<xml_diff>
--- a/docs/para-drive/Alcance v2.docx
+++ b/docs/para-drive/Alcance v2.docx
@@ -16,7 +16,7 @@
         <w:pStyle w:val="FirstParagraph"/>
       </w:pPr>
       <w:r>
-        <w:t xml:space="preserve">Versión del 6 de octubre de 2026 · Emmanuel Artunduaga Charry · Jawer Leonardo Manrique Yosa</w:t>
+        <w:t xml:space="preserve">Versión del 6 de octubre de 2026, ajustada el 9 de octubre · Emmanuel Artunduaga Charry · Jawer Leonardo Manrique Yosa</w:t>
       </w:r>
     </w:p>
     <w:p>
@@ -24,7 +24,7 @@
         <w:pStyle w:val="BodyText"/>
       </w:pPr>
       <w:r>
-        <w:t xml:space="preserve">El sistema pasa a ser una página donde cualquier paciente agenda su cita sin crear cuenta, con aviso por WhatsApp, y un panel único para la secretaria. La entrega es en unas 2 semanas, con la página publicada en un servidor. Este documento reemplaza al alcance del anteproyecto en todo lo que lo contradiga.</w:t>
+        <w:t xml:space="preserve">El sistema pasa a ser una página donde cualquier paciente pide su cita sin crear cuenta, la secretaria la acepta desde su panel y al paciente le llega la confirmación por WhatsApp. La entrega es en unas 2 semanas, con la página publicada en un servidor. Este documento reemplaza al alcance del anteproyecto en todo lo que lo contradiga.</w:t>
       </w:r>
     </w:p>
     <w:bookmarkStart w:id="20" w:name="qué-cambió"/>
@@ -41,7 +41,7 @@
         <w:pStyle w:val="FirstParagraph"/>
       </w:pPr>
       <w:r>
-        <w:t xml:space="preserve">Los cambios salen de la reunión con el docente asesor del 5 de octubre de 2026 y de la conversación con la clínica.</w:t>
+        <w:t xml:space="preserve">Los cambios salen de la reunión con el docente asesor del 5 de octubre de 2026, de la conversación con la clínica y del ajuste del 9 de octubre (citas por aprobar y pacientes sin login).</w:t>
       </w:r>
     </w:p>
     <w:tbl>
@@ -168,7 +168,7 @@
               <w:jc w:val="left"/>
             </w:pPr>
             <w:r>
-              <w:t xml:space="preserve">La secretaria crea el usuario cuando el paciente ya asistió al consultorio</w:t>
+              <w:t xml:space="preserve">Los pacientes no tienen usuario ni contraseña: son un registro (ficha) con su historia clínica. Solo la secretaria inicia sesión</w:t>
             </w:r>
           </w:p>
         </w:tc>
@@ -206,7 +206,7 @@
               <w:jc w:val="left"/>
             </w:pPr>
             <w:r>
-              <w:t xml:space="preserve">Sin iniciar sesión: nombre, documento y teléfono (correo opcional)</w:t>
+              <w:t xml:space="preserve">Sin iniciar sesión: nombre, documento, teléfono y correo. La cita queda pendiente hasta que la secretaria la acepta</w:t>
             </w:r>
           </w:p>
         </w:tc>
@@ -535,7 +535,7 @@
           <w:bCs/>
           <w:b/>
         </w:rPr>
-        <w:t xml:space="preserve">Agendar (sin cuenta)</w:t>
+        <w:t xml:space="preserve">Pedir la cita (sin cuenta)</w:t>
       </w:r>
       <w:r>
         <w:t xml:space="preserve"> </w:t>
@@ -565,18 +565,68 @@
         <w:t xml:space="preserve"> </w:t>
       </w:r>
       <w:r>
-        <w:t xml:space="preserve">5. Ve el resumen de lo elegido y escribe nombre, documento, teléfono y, si quiere, correo. Marca la casilla de autorización de datos, que viene sin marcar y con enlace a la política.</w:t>
+        <w:t xml:space="preserve">5. Ve el resumen de lo elegido y escribe nombre, documento, teléfono y correo. Marca la casilla de autorización de datos, que viene sin marcar y con enlace a la política.</w:t>
       </w:r>
       <w:r>
         <w:t xml:space="preserve"> </w:t>
       </w:r>
       <w:r>
-        <w:t xml:space="preserve">6. Confirma. La cita queda confirmada y le llega un WhatsApp con fecha, hora, especialista y dirección, más un enlace a</w:t>
+        <w:t xml:space="preserve">6. Envía la solicitud. La cita queda</w:t>
       </w:r>
       <w:r>
         <w:t xml:space="preserve"> </w:t>
       </w:r>
       <w:r>
+        <w:rPr>
+          <w:bCs/>
+          <w:b/>
+        </w:rPr>
+        <w:t xml:space="preserve">pendiente</w:t>
+      </w:r>
+      <w:r>
+        <w:t xml:space="preserve"> </w:t>
+      </w:r>
+      <w:r>
+        <w:t xml:space="preserve">y la hora queda apartada.</w:t>
+      </w:r>
+    </w:p>
+    <w:p>
+      <w:pPr>
+        <w:pStyle w:val="BodyText"/>
+      </w:pPr>
+      <w:r>
+        <w:rPr>
+          <w:bCs/>
+          <w:b/>
+        </w:rPr>
+        <w:t xml:space="preserve">La secretaria responde</w:t>
+      </w:r>
+      <w:r>
+        <w:t xml:space="preserve"> </w:t>
+      </w:r>
+      <w:r>
+        <w:t xml:space="preserve">-</w:t>
+      </w:r>
+      <w:r>
+        <w:t xml:space="preserve"> </w:t>
+      </w:r>
+      <w:r>
+        <w:rPr>
+          <w:bCs/>
+          <w:b/>
+        </w:rPr>
+        <w:t xml:space="preserve">Acepta:</w:t>
+      </w:r>
+      <w:r>
+        <w:t xml:space="preserve"> </w:t>
+      </w:r>
+      <w:r>
+        <w:t xml:space="preserve">la cita queda confirmada y al paciente le llega un WhatsApp con fecha, hora, especialista y dirección, más un enlace a</w:t>
+      </w:r>
+      <w:r>
+        <w:t xml:space="preserve"> </w:t>
+      </w:r>
+      <w:r>
         <w:t xml:space="preserve">“</w:t>
       </w:r>
       <w:r>
@@ -586,7 +636,35 @@
         <w:t xml:space="preserve">”</w:t>
       </w:r>
       <w:r>
-        <w:t xml:space="preserve">.</w:t>
+        <w:t xml:space="preserve">. Si es su primera cita, se crea su ficha de paciente (por documento) con su historia clínica.</w:t>
+      </w:r>
+      <w:r>
+        <w:t xml:space="preserve"> </w:t>
+      </w:r>
+      <w:r>
+        <w:t xml:space="preserve">-</w:t>
+      </w:r>
+      <w:r>
+        <w:t xml:space="preserve"> </w:t>
+      </w:r>
+      <w:r>
+        <w:rPr>
+          <w:bCs/>
+          <w:b/>
+        </w:rPr>
+        <w:t xml:space="preserve">Rechaza:</w:t>
+      </w:r>
+      <w:r>
+        <w:t xml:space="preserve"> </w:t>
+      </w:r>
+      <w:r>
+        <w:t xml:space="preserve">la hora se libera y le llega un WhatsApp invitándolo a pedir otra.</w:t>
+      </w:r>
+      <w:r>
+        <w:t xml:space="preserve"> </w:t>
+      </w:r>
+      <w:r>
+        <w:t xml:space="preserve">- Unas 24 horas antes de la cita le llega un recordatorio.</w:t>
       </w:r>
     </w:p>
     <w:p>
@@ -626,7 +704,7 @@
         <w:t xml:space="preserve"> </w:t>
       </w:r>
       <w:r>
-        <w:t xml:space="preserve">usa el mismo calendario del especialista. La hora anterior se libera. Solo se permite una vez.</w:t>
+        <w:t xml:space="preserve">usa el mismo calendario del especialista. La hora anterior se libera. Solo se permite una vez, y la nueva hora vuelve a quedar pendiente hasta que la secretaria la acepte.</w:t>
       </w:r>
       <w:r>
         <w:t xml:space="preserve"> </w:t>
@@ -687,19 +765,31 @@
           <w:bCs/>
           <w:b/>
         </w:rPr>
-        <w:t xml:space="preserve">Después de la primera visita</w:t>
+        <w:t xml:space="preserve">Si llega al consultorio sin pasar por la web</w:t>
       </w:r>
       <w:r>
         <w:t xml:space="preserve"> </w:t>
       </w:r>
       <w:r>
-        <w:t xml:space="preserve">- Si el paciente asistió, la secretaria le crea un usuario. El sistema genera una clave temporal, que el paciente cambia en su primer ingreso. Las citas que pidió antes sin cuenta quedan asociadas a su usuario.</w:t>
+        <w:t xml:space="preserve">- La secretaria lo registra en el panel (nombre, documento, celular, correo y autorización de datos) y le agenda la cita desde su ficha. La cita queda confirmada de una vez y le llega el mismo WhatsApp. De ahí en adelante sigue el flujo normal.</w:t>
+      </w:r>
+    </w:p>
+    <w:p>
+      <w:pPr>
+        <w:pStyle w:val="BodyText"/>
+      </w:pPr>
+      <w:r>
+        <w:rPr>
+          <w:bCs/>
+          <w:b/>
+        </w:rPr>
+        <w:t xml:space="preserve">Historia clínica</w:t>
       </w:r>
       <w:r>
         <w:t xml:space="preserve"> </w:t>
       </w:r>
       <w:r>
-        <w:t xml:space="preserve">- Con usuario, el paciente ve sus citas y agenda con sus datos ya cargados.</w:t>
+        <w:t xml:space="preserve">- Cada paciente tiene su ficha con citas e historia clínica. La secretaria la complementa después de cada cita atendida.</w:t>
       </w:r>
     </w:p>
     <w:bookmarkEnd w:id="21"/>
@@ -847,6 +937,32 @@
               <w:jc w:val="left"/>
             </w:pPr>
             <w:r>
+              <w:t xml:space="preserve">Solicitudes</w:t>
+            </w:r>
+          </w:p>
+        </w:tc>
+        <w:tc>
+          <w:tcPr/>
+          <w:p>
+            <w:pPr>
+              <w:pStyle w:val="Compact"/>
+              <w:jc w:val="left"/>
+            </w:pPr>
+            <w:r>
+              <w:t xml:space="preserve">Ver las citas pedidas por la web; aceptarlas (se envía la confirmación) o rechazarlas (se libera la hora)</w:t>
+            </w:r>
+          </w:p>
+        </w:tc>
+      </w:tr>
+      <w:tr>
+        <w:tc>
+          <w:tcPr/>
+          <w:p>
+            <w:pPr>
+              <w:pStyle w:val="Compact"/>
+              <w:jc w:val="left"/>
+            </w:pPr>
+            <w:r>
               <w:t xml:space="preserve">Agenda</w:t>
             </w:r>
           </w:p>
@@ -885,7 +1001,7 @@
               <w:jc w:val="left"/>
             </w:pPr>
             <w:r>
-              <w:t xml:space="preserve">Crear usuario (genera clave temporal), buscar por nombre, documento o correo, ver la ficha con citas e historia</w:t>
+              <w:t xml:space="preserve">Registrar a quien llega al consultorio, buscar por nombre, documento, celular o correo, ver la ficha con citas e historia y agendarle una cita</w:t>
             </w:r>
           </w:p>
         </w:tc>
@@ -963,25 +1079,19 @@
               <w:jc w:val="left"/>
             </w:pPr>
             <w:r>
-              <w:t xml:space="preserve">Un solo formulario</w:t>
+              <w:t xml:space="preserve">“</w:t>
+            </w:r>
+            <w:r>
+              <w:t xml:space="preserve">Acceso del consultorio</w:t>
+            </w:r>
+            <w:r>
+              <w:t xml:space="preserve">”</w:t>
             </w:r>
             <w:r>
               <w:t xml:space="preserve"> </w:t>
             </w:r>
             <w:r>
-              <w:t xml:space="preserve">“</w:t>
-            </w:r>
-            <w:r>
-              <w:t xml:space="preserve">Ingresar</w:t>
-            </w:r>
-            <w:r>
-              <w:t xml:space="preserve">”</w:t>
-            </w:r>
-            <w:r>
-              <w:t xml:space="preserve"> </w:t>
-            </w:r>
-            <w:r>
-              <w:t xml:space="preserve">para la secretaria y los pacientes con usuario; el sistema lleva a cada uno a su panel</w:t>
+              <w:t xml:space="preserve">en el pie de la página principal; solo para la secretaria</w:t>
             </w:r>
           </w:p>
         </w:tc>
@@ -1058,21 +1168,47 @@
               <w:jc w:val="left"/>
             </w:pPr>
             <w:r>
-              <w:t xml:space="preserve">Nombre, documento y teléfono; correo opcional</w:t>
-            </w:r>
-          </w:p>
-        </w:tc>
-      </w:tr>
-      <w:tr>
-        <w:tc>
-          <w:tcPr/>
-          <w:p>
-            <w:pPr>
-              <w:pStyle w:val="Compact"/>
-              <w:jc w:val="left"/>
-            </w:pPr>
-            <w:r>
-              <w:t xml:space="preserve">Estado al agendar</w:t>
+              <w:t xml:space="preserve">Nombre, documento, teléfono y correo, todos obligatorios</w:t>
+            </w:r>
+          </w:p>
+        </w:tc>
+      </w:tr>
+      <w:tr>
+        <w:tc>
+          <w:tcPr/>
+          <w:p>
+            <w:pPr>
+              <w:pStyle w:val="Compact"/>
+              <w:jc w:val="left"/>
+            </w:pPr>
+            <w:r>
+              <w:t xml:space="preserve">Estado al pedir la cita</w:t>
+            </w:r>
+          </w:p>
+        </w:tc>
+        <w:tc>
+          <w:tcPr/>
+          <w:p>
+            <w:pPr>
+              <w:pStyle w:val="Compact"/>
+              <w:jc w:val="left"/>
+            </w:pPr>
+            <w:r>
+              <w:t xml:space="preserve">Pendiente: aparta la hora hasta que la secretaria la acepte o la rechace</w:t>
+            </w:r>
+          </w:p>
+        </w:tc>
+      </w:tr>
+      <w:tr>
+        <w:tc>
+          <w:tcPr/>
+          <w:p>
+            <w:pPr>
+              <w:pStyle w:val="Compact"/>
+              <w:jc w:val="left"/>
+            </w:pPr>
+            <w:r>
+              <w:t xml:space="preserve">Estado al agendar la secretaria</w:t>
             </w:r>
           </w:p>
         </w:tc>
@@ -1110,7 +1246,7 @@
               <w:jc w:val="left"/>
             </w:pPr>
             <w:r>
-              <w:t xml:space="preserve">1 por cita; después solo puede cancelar y pedir otra</w:t>
+              <w:t xml:space="preserve">1 por cita; la nueva hora vuelve a pendiente. Después solo puede cancelar y pedir otra</w:t>
             </w:r>
           </w:p>
         </w:tc>
@@ -1176,7 +1312,7 @@
               <w:jc w:val="left"/>
             </w:pPr>
             <w:r>
-              <w:t xml:space="preserve">Citas canceladas</w:t>
+              <w:t xml:space="preserve">Citas canceladas o rechazadas</w:t>
             </w:r>
           </w:p>
         </w:tc>
@@ -1203,6 +1339,24 @@
               <w:t xml:space="preserve">”</w:t>
             </w:r>
             <w:r>
+              <w:t xml:space="preserve"> </w:t>
+            </w:r>
+            <w:r>
+              <w:t xml:space="preserve">o</w:t>
+            </w:r>
+            <w:r>
+              <w:t xml:space="preserve"> </w:t>
+            </w:r>
+            <w:r>
+              <w:t xml:space="preserve">“</w:t>
+            </w:r>
+            <w:r>
+              <w:t xml:space="preserve">rechazada</w:t>
+            </w:r>
+            <w:r>
+              <w:t xml:space="preserve">”</w:t>
+            </w:r>
+            <w:r>
               <w:t xml:space="preserve">, no se borran</w:t>
             </w:r>
           </w:p>
@@ -1217,19 +1371,19 @@
               <w:jc w:val="left"/>
             </w:pPr>
             <w:r>
-              <w:t xml:space="preserve">Citas activas por documento sin usuario</w:t>
-            </w:r>
-          </w:p>
-        </w:tc>
-        <w:tc>
-          <w:tcPr/>
-          <w:p>
-            <w:pPr>
-              <w:pStyle w:val="Compact"/>
-              <w:jc w:val="left"/>
-            </w:pPr>
-            <w:r>
-              <w:t xml:space="preserve">Máximo 1 (configurable) — por confirmar</w:t>
+              <w:t xml:space="preserve">Citas pendientes o confirmadas por documento</w:t>
+            </w:r>
+          </w:p>
+        </w:tc>
+        <w:tc>
+          <w:tcPr/>
+          <w:p>
+            <w:pPr>
+              <w:pStyle w:val="Compact"/>
+              <w:jc w:val="left"/>
+            </w:pPr>
+            <w:r>
+              <w:t xml:space="preserve">Máximo 1 a la vez desde la web (configurable) — por confirmar</w:t>
             </w:r>
           </w:p>
         </w:tc>
@@ -1406,19 +1560,45 @@
               <w:jc w:val="left"/>
             </w:pPr>
             <w:r>
-              <w:t xml:space="preserve">Al agendar</w:t>
-            </w:r>
-          </w:p>
-        </w:tc>
-        <w:tc>
-          <w:tcPr/>
-          <w:p>
-            <w:pPr>
-              <w:pStyle w:val="Compact"/>
-              <w:jc w:val="left"/>
-            </w:pPr>
-            <w:r>
-              <w:t xml:space="preserve">Hola Ana, tu cita en Arte Odontológico quedó agendada para el jueves 15 de octubre a las 3:00 p. m. con Dra. Laura Gómez, en Carrera 7 No. 3-61, Rivera. Para reprogramar o cancelar: [enlace]</w:t>
+              <w:t xml:space="preserve">Al aceptar la cita</w:t>
+            </w:r>
+          </w:p>
+        </w:tc>
+        <w:tc>
+          <w:tcPr/>
+          <w:p>
+            <w:pPr>
+              <w:pStyle w:val="Compact"/>
+              <w:jc w:val="left"/>
+            </w:pPr>
+            <w:r>
+              <w:t xml:space="preserve">Hola Ana, tu cita en Arte Odontológico quedó confirmada para el jueves 15 de octubre a las 3:00 p. m. con Dra. Laura Gómez, en Carrera 7 No. 3-61, Rivera. Para reprogramar o cancelar: [enlace]</w:t>
+            </w:r>
+          </w:p>
+        </w:tc>
+      </w:tr>
+      <w:tr>
+        <w:tc>
+          <w:tcPr/>
+          <w:p>
+            <w:pPr>
+              <w:pStyle w:val="Compact"/>
+              <w:jc w:val="left"/>
+            </w:pPr>
+            <w:r>
+              <w:t xml:space="preserve">Al rechazarla</w:t>
+            </w:r>
+          </w:p>
+        </w:tc>
+        <w:tc>
+          <w:tcPr/>
+          <w:p>
+            <w:pPr>
+              <w:pStyle w:val="Compact"/>
+              <w:jc w:val="left"/>
+            </w:pPr>
+            <w:r>
+              <w:t xml:space="preserve">Hola Ana, no pudimos confirmar tu cita en Arte Odontológico del [día] a las [hora]; por favor pide otra hora en [página] o responde este mensaje y te ayudamos.</w:t>
             </w:r>
           </w:p>
         </w:tc>
@@ -1484,19 +1664,19 @@
               <w:jc w:val="left"/>
             </w:pPr>
             <w:r>
-              <w:t xml:space="preserve">Recordatorio (día anterior)</w:t>
-            </w:r>
-          </w:p>
-        </w:tc>
-        <w:tc>
-          <w:tcPr/>
-          <w:p>
-            <w:pPr>
-              <w:pStyle w:val="Compact"/>
-              <w:jc w:val="left"/>
-            </w:pPr>
-            <w:r>
-              <w:t xml:space="preserve">Hola Ana, te recordamos tu cita en Arte Odontológico el [día] a las [hora] con [especialista], en [dirección]. Si no puedes asistir: [enlace]</w:t>
+              <w:t xml:space="preserve">Recordatorio (24 horas antes)</w:t>
+            </w:r>
+          </w:p>
+        </w:tc>
+        <w:tc>
+          <w:tcPr/>
+          <w:p>
+            <w:pPr>
+              <w:pStyle w:val="Compact"/>
+              <w:jc w:val="left"/>
+            </w:pPr>
+            <w:r>
+              <w:t xml:space="preserve">Hola Ana, te recordamos tu cita en Arte Odontológico el [día] a las [hora] con [especialista], en [dirección]. Si no puedes asistir, avísanos respondiendo este mensaje.</w:t>
             </w:r>
           </w:p>
         </w:tc>
@@ -1565,6 +1745,44 @@
               <w:jc w:val="left"/>
             </w:pPr>
             <w:r>
+              <w:t xml:space="preserve">Twilio (pruebas)</w:t>
+            </w:r>
+          </w:p>
+        </w:tc>
+        <w:tc>
+          <w:tcPr/>
+          <w:p>
+            <w:pPr>
+              <w:pStyle w:val="Compact"/>
+              <w:jc w:val="left"/>
+            </w:pPr>
+            <w:r>
+              <w:t xml:space="preserve">El servidor envía el texto con el WhatsApp Sandbox de Twilio</w:t>
+            </w:r>
+          </w:p>
+        </w:tc>
+        <w:tc>
+          <w:tcPr/>
+          <w:p>
+            <w:pPr>
+              <w:pStyle w:val="Compact"/>
+              <w:jc w:val="left"/>
+            </w:pPr>
+            <w:r>
+              <w:t xml:space="preserve">Cuenta de Twilio; cada número debe unirse al sandbox</w:t>
+            </w:r>
+          </w:p>
+        </w:tc>
+      </w:tr>
+      <w:tr>
+        <w:tc>
+          <w:tcPr/>
+          <w:p>
+            <w:pPr>
+              <w:pStyle w:val="Compact"/>
+              <w:jc w:val="left"/>
+            </w:pPr>
+            <w:r>
               <w:t xml:space="preserve">Manual (respaldo garantizado)</w:t>
             </w:r>
           </w:p>
@@ -1715,7 +1933,7 @@
         <w:t xml:space="preserve"> </w:t>
       </w:r>
       <w:r>
-        <w:t xml:space="preserve">casilla sin marcar por defecto, con enlace a la política. Cada cita guarda la autorización, la fecha y la versión de la política. Al crear un usuario, queda registrado qué secretaria recogió la autorización.</w:t>
+        <w:t xml:space="preserve">casilla sin marcar por defecto, con enlace a la política. Cada cita guarda la autorización, la fecha y la versión de la política. La ficha del paciente guarda la misma información y qué secretaria la creó.</w:t>
       </w:r>
     </w:p>
     <w:p>
@@ -1799,7 +2017,7 @@
         <w:t xml:space="preserve"> </w:t>
       </w:r>
       <w:r>
-        <w:t xml:space="preserve">cifradas con bcrypt.</w:t>
+        <w:t xml:space="preserve">solo la secretaria tiene; cifradas con bcrypt.</w:t>
       </w:r>
     </w:p>
     <w:p>
@@ -1877,7 +2095,7 @@
         <w:pStyle w:val="Compact"/>
       </w:pPr>
       <w:r>
-        <w:t xml:space="preserve">☐ Si el paciente con usuario puede ver su propia historia clínica</w:t>
+        <w:t xml:space="preserve">☐ Confirmar el límite de 1 cita activa por documento; decidir el bloqueo por inasistencias</w:t>
       </w:r>
     </w:p>
     <w:p>
@@ -1889,7 +2107,7 @@
         <w:pStyle w:val="Compact"/>
       </w:pPr>
       <w:r>
-        <w:t xml:space="preserve">☐ Confirmar el límite de 1 cita activa sin usuario; decidir el bloqueo por inasistencias</w:t>
+        <w:t xml:space="preserve">☐ Cuánto tiempo puede quedar una solicitud sin respuesta antes de liberarse sola</w:t>
       </w:r>
     </w:p>
     <w:p>

</xml_diff>

<commit_message>
docs: citas de la web confirmadas al pedirlas (decisión 27)
Alcance, contrato de la API, modelo de datos y diagrama, manuales, guía de pruebas y resultados; Word regenerados.
</commit_message>
<xml_diff>
--- a/docs/para-drive/Alcance v2.docx
+++ b/docs/para-drive/Alcance v2.docx
@@ -206,7 +206,7 @@
               <w:jc w:val="left"/>
             </w:pPr>
             <w:r>
-              <w:t xml:space="preserve">Sin iniciar sesión: nombre, documento, teléfono y correo. La cita queda pendiente hasta que la secretaria la acepta</w:t>
+              <w:t xml:space="preserve">Sin iniciar sesión: nombres, apellidos, tipo y número de documento, correo y celular. La cita queda confirmada de una vez</w:t>
             </w:r>
           </w:p>
         </w:tc>
@@ -565,13 +565,13 @@
         <w:t xml:space="preserve"> </w:t>
       </w:r>
       <w:r>
-        <w:t xml:space="preserve">5. Ve el resumen de lo elegido y escribe nombre, documento, teléfono y correo. Marca la casilla de autorización de datos, que viene sin marcar y con enlace a la política.</w:t>
+        <w:t xml:space="preserve">5. Ve el resumen de lo elegido y escribe nombres, apellidos, tipo y número de documento, correo, celular y, si quiere, teléfono fijo. Marca la casilla de autorización de datos, que viene sin marcar y con enlace a la política.</w:t>
       </w:r>
       <w:r>
         <w:t xml:space="preserve"> </w:t>
       </w:r>
       <w:r>
-        <w:t xml:space="preserve">6. Envía la solicitud. La cita queda</w:t>
+        <w:t xml:space="preserve">6. Pide la cita. Queda</w:t>
       </w:r>
       <w:r>
         <w:t xml:space="preserve"> </w:t>
@@ -581,84 +581,49 @@
           <w:bCs/>
           <w:b/>
         </w:rPr>
-        <w:t xml:space="preserve">pendiente</w:t>
+        <w:t xml:space="preserve">confirmada</w:t>
       </w:r>
       <w:r>
         <w:t xml:space="preserve"> </w:t>
       </w:r>
       <w:r>
-        <w:t xml:space="preserve">y la hora queda apartada.</w:t>
-      </w:r>
-    </w:p>
-    <w:p>
-      <w:pPr>
-        <w:pStyle w:val="BodyText"/>
-      </w:pPr>
-      <w:r>
-        <w:rPr>
-          <w:bCs/>
-          <w:b/>
-        </w:rPr>
-        <w:t xml:space="preserve">La secretaria responde</w:t>
+        <w:t xml:space="preserve">de una vez (decisión 27): le llega un WhatsApp con fecha, hora, especialista y dirección, más un enlace a</w:t>
       </w:r>
       <w:r>
         <w:t xml:space="preserve"> </w:t>
       </w:r>
       <w:r>
-        <w:t xml:space="preserve">-</w:t>
+        <w:t xml:space="preserve">“</w:t>
+      </w:r>
+      <w:r>
+        <w:t xml:space="preserve">Gestionar mi cita</w:t>
+      </w:r>
+      <w:r>
+        <w:t xml:space="preserve">”</w:t>
+      </w:r>
+      <w:r>
+        <w:t xml:space="preserve">. Si es su primera cita, se crea su ficha de paciente (por documento).</w:t>
       </w:r>
       <w:r>
         <w:t xml:space="preserve"> </w:t>
       </w:r>
       <w:r>
-        <w:rPr>
-          <w:bCs/>
-          <w:b/>
-        </w:rPr>
-        <w:t xml:space="preserve">Acepta:</w:t>
+        <w:t xml:space="preserve">- La secretaria no tiene que aprobar nada: ve las citas nuevas en</w:t>
       </w:r>
       <w:r>
         <w:t xml:space="preserve"> </w:t>
       </w:r>
       <w:r>
-        <w:t xml:space="preserve">la cita queda confirmada y al paciente le llega un WhatsApp con fecha, hora, especialista y dirección, más un enlace a</w:t>
-      </w:r>
-      <w:r>
-        <w:t xml:space="preserve"> </w:t>
-      </w:r>
-      <w:r>
         <w:t xml:space="preserve">“</w:t>
       </w:r>
       <w:r>
-        <w:t xml:space="preserve">Gestionar mi cita</w:t>
+        <w:t xml:space="preserve">Novedades de la web</w:t>
       </w:r>
       <w:r>
         <w:t xml:space="preserve">”</w:t>
       </w:r>
       <w:r>
-        <w:t xml:space="preserve">. Si es su primera cita, se crea su ficha de paciente (por documento) con su historia clínica.</w:t>
-      </w:r>
-      <w:r>
-        <w:t xml:space="preserve"> </w:t>
-      </w:r>
-      <w:r>
-        <w:t xml:space="preserve">-</w:t>
-      </w:r>
-      <w:r>
-        <w:t xml:space="preserve"> </w:t>
-      </w:r>
-      <w:r>
-        <w:rPr>
-          <w:bCs/>
-          <w:b/>
-        </w:rPr>
-        <w:t xml:space="preserve">Rechaza:</w:t>
-      </w:r>
-      <w:r>
-        <w:t xml:space="preserve"> </w:t>
-      </w:r>
-      <w:r>
-        <w:t xml:space="preserve">la hora se libera y le llega un WhatsApp invitándolo a pedir otra.</w:t>
+        <w:t xml:space="preserve">.</w:t>
       </w:r>
       <w:r>
         <w:t xml:space="preserve"> </w:t>
@@ -704,7 +669,7 @@
         <w:t xml:space="preserve"> </w:t>
       </w:r>
       <w:r>
-        <w:t xml:space="preserve">usa el mismo calendario del especialista. La hora anterior se libera. Solo se permite una vez, y la nueva hora vuelve a quedar pendiente hasta que la secretaria la acepte.</w:t>
+        <w:t xml:space="preserve">usa el mismo calendario del especialista. La hora anterior se libera. Solo se permite una vez; el cambio queda confirmado y le llega el aviso por WhatsApp.</w:t>
       </w:r>
       <w:r>
         <w:t xml:space="preserve"> </w:t>
@@ -937,19 +902,19 @@
               <w:jc w:val="left"/>
             </w:pPr>
             <w:r>
-              <w:t xml:space="preserve">Solicitudes</w:t>
-            </w:r>
-          </w:p>
-        </w:tc>
-        <w:tc>
-          <w:tcPr/>
-          <w:p>
-            <w:pPr>
-              <w:pStyle w:val="Compact"/>
-              <w:jc w:val="left"/>
-            </w:pPr>
-            <w:r>
-              <w:t xml:space="preserve">Ver las citas pedidas por la web; aceptarlas (se envía la confirmación) o rechazarlas (se libera la hora)</w:t>
+              <w:t xml:space="preserve">Novedades de la web</w:t>
+            </w:r>
+          </w:p>
+        </w:tc>
+        <w:tc>
+          <w:tcPr/>
+          <w:p>
+            <w:pPr>
+              <w:pStyle w:val="Compact"/>
+              <w:jc w:val="left"/>
+            </w:pPr>
+            <w:r>
+              <w:t xml:space="preserve">Ver en Inicio las citas pedidas por la web en las últimas 48 horas (ya confirmadas) y los cambios de hora y cancelaciones que hizo el paciente</w:t>
             </w:r>
           </w:p>
         </w:tc>
@@ -1053,7 +1018,7 @@
               <w:jc w:val="left"/>
             </w:pPr>
             <w:r>
-              <w:t xml:space="preserve">Ver los pendientes, enviarlos con un clic desde su WhatsApp Business y marcarlos como enviados</w:t>
+              <w:t xml:space="preserve">Se envían solos; si alguno falla, aparece en Inicio para enviarlo a mano</w:t>
             </w:r>
           </w:p>
         </w:tc>
@@ -1168,7 +1133,7 @@
               <w:jc w:val="left"/>
             </w:pPr>
             <w:r>
-              <w:t xml:space="preserve">Nombre, documento, teléfono y correo, todos obligatorios</w:t>
+              <w:t xml:space="preserve">Nombres, apellidos, tipo y número de documento, correo y celular; teléfono fijo opcional</w:t>
             </w:r>
           </w:p>
         </w:tc>
@@ -1194,7 +1159,7 @@
               <w:jc w:val="left"/>
             </w:pPr>
             <w:r>
-              <w:t xml:space="preserve">Pendiente: aparta la hora hasta que la secretaria la acepte o la rechace</w:t>
+              <w:t xml:space="preserve">Confirmada de inmediato (decisión 27)</w:t>
             </w:r>
           </w:p>
         </w:tc>
@@ -1246,7 +1211,7 @@
               <w:jc w:val="left"/>
             </w:pPr>
             <w:r>
-              <w:t xml:space="preserve">1 por cita; la nueva hora vuelve a pendiente. Después solo puede cancelar y pedir otra</w:t>
+              <w:t xml:space="preserve">1 por cita; el cambio queda confirmado. Después solo puede cancelar y pedir otra</w:t>
             </w:r>
           </w:p>
         </w:tc>
@@ -1560,7 +1525,7 @@
               <w:jc w:val="left"/>
             </w:pPr>
             <w:r>
-              <w:t xml:space="preserve">Al aceptar la cita</w:t>
+              <w:t xml:space="preserve">Al pedir la cita</w:t>
             </w:r>
           </w:p>
         </w:tc>
@@ -1586,7 +1551,7 @@
               <w:jc w:val="left"/>
             </w:pPr>
             <w:r>
-              <w:t xml:space="preserve">Al rechazarla</w:t>
+              <w:t xml:space="preserve">Al rechazar una cita pendiente antigua</w:t>
             </w:r>
           </w:p>
         </w:tc>
@@ -2096,18 +2061,6 @@
       </w:pPr>
       <w:r>
         <w:t xml:space="preserve">☐ Confirmar el límite de 1 cita activa por documento; decidir el bloqueo por inasistencias</w:t>
-      </w:r>
-    </w:p>
-    <w:p>
-      <w:pPr>
-        <w:numPr>
-          <w:ilvl w:val="0"/>
-          <w:numId w:val="1002"/>
-        </w:numPr>
-        <w:pStyle w:val="Compact"/>
-      </w:pPr>
-      <w:r>
-        <w:t xml:space="preserve">☐ Cuánto tiempo puede quedar una solicitud sin respuesta antes de liberarse sola</w:t>
       </w:r>
     </w:p>
     <w:p>

</xml_diff>

<commit_message>
docs: sincronizar la documentación con el sistema vigente
- Diagramas: arquitectura y entidad-relación con las 11 tablas, el
  odontograma, el rol superadmin y el perfil de especialistas; PNG
  regenerados.
- Modelo de datos: tabla odontograma, estado y revisión de la historia
  clínica, rol superadmin y valores heredados (rol paciente, canal correo).
- Manual técnico: flujo con cita confirmada al pedirla, propietaria,
  aprobaciones, odontograma, rutas, seguridad y limitaciones conocidas.
- Alcance v2: rol de la propietaria, odontograma y especialistas.
- Manual de instalación: Node 20, 11 tablas, repositorio público.
- Manual de usuario: dirección del sistema publicado.
- Pruebas: 140 comprobaciones documentadas, nota sobre el modelo anterior,
  script y 53 comprobaciones de la propietaria pendientes de incorporar.
- README raíz reescrito con la estructura real.
- Word de docs/para-drive regenerados.
</commit_message>
<xml_diff>
--- a/docs/para-drive/Alcance v2.docx
+++ b/docs/para-drive/Alcance v2.docx
@@ -16,7 +16,7 @@
         <w:pStyle w:val="FirstParagraph"/>
       </w:pPr>
       <w:r>
-        <w:t xml:space="preserve">Versión del 6 de octubre de 2026, ajustada el 9 de octubre · Emmanuel Artunduaga Charry · Jawer Leonardo Manrique Yosa</w:t>
+        <w:t xml:space="preserve">Versión del 6 de octubre de 2026, ajustada el 9 y el 22 de octubre · Emmanuel Artunduaga Charry · Jawer Leonardo Manrique Yosa</w:t>
       </w:r>
     </w:p>
     <w:p>
@@ -472,7 +472,95 @@
               <w:jc w:val="left"/>
             </w:pPr>
             <w:r>
-              <w:t xml:space="preserve">En unas 2 semanas, publicada en servidor</w:t>
+              <w:t xml:space="preserve">En unas 2 semanas, publicada en servidor (Railway)</w:t>
+            </w:r>
+          </w:p>
+        </w:tc>
+      </w:tr>
+      <w:tr>
+        <w:tc>
+          <w:tcPr/>
+          <w:p>
+            <w:pPr>
+              <w:pStyle w:val="Compact"/>
+              <w:jc w:val="left"/>
+            </w:pPr>
+            <w:r>
+              <w:t xml:space="preserve">Dueña del consultorio</w:t>
+            </w:r>
+          </w:p>
+        </w:tc>
+        <w:tc>
+          <w:tcPr/>
+          <w:p>
+            <w:pPr>
+              <w:pStyle w:val="Compact"/>
+              <w:jc w:val="left"/>
+            </w:pPr>
+            <w:r>
+              <w:t xml:space="preserve">No existía</w:t>
+            </w:r>
+          </w:p>
+        </w:tc>
+        <w:tc>
+          <w:tcPr/>
+          <w:p>
+            <w:pPr>
+              <w:pStyle w:val="Compact"/>
+              <w:jc w:val="left"/>
+            </w:pPr>
+            <w:r>
+              <w:t xml:space="preserve">Rol</w:t>
+            </w:r>
+            <w:r>
+              <w:t xml:space="preserve"> </w:t>
+            </w:r>
+            <w:r>
+              <w:rPr>
+                <w:rStyle w:val="VerbatimChar"/>
+              </w:rPr>
+              <w:t xml:space="preserve">superadmin</w:t>
+            </w:r>
+            <w:r>
+              <w:t xml:space="preserve">: ve y cambia todo, aprueba las correcciones de la historia y las anulaciones del odontograma, y administra al equipo y a los especialistas (decisiones 30 y 32)</w:t>
+            </w:r>
+          </w:p>
+        </w:tc>
+      </w:tr>
+      <w:tr>
+        <w:tc>
+          <w:tcPr/>
+          <w:p>
+            <w:pPr>
+              <w:pStyle w:val="Compact"/>
+              <w:jc w:val="left"/>
+            </w:pPr>
+            <w:r>
+              <w:t xml:space="preserve">Odontograma</w:t>
+            </w:r>
+          </w:p>
+        </w:tc>
+        <w:tc>
+          <w:tcPr/>
+          <w:p>
+            <w:pPr>
+              <w:pStyle w:val="Compact"/>
+              <w:jc w:val="left"/>
+            </w:pPr>
+            <w:r>
+              <w:t xml:space="preserve">No existía</w:t>
+            </w:r>
+          </w:p>
+        </w:tc>
+        <w:tc>
+          <w:tcPr/>
+          <w:p>
+            <w:pPr>
+              <w:pStyle w:val="Compact"/>
+              <w:jc w:val="left"/>
+            </w:pPr>
+            <w:r>
+              <w:t xml:space="preserve">Hallazgos por diente y cara con numeración FDI, dentro de la ficha del paciente (decisión 30)</w:t>
             </w:r>
           </w:p>
         </w:tc>
@@ -772,7 +860,43 @@
         <w:pStyle w:val="FirstParagraph"/>
       </w:pPr>
       <w:r>
-        <w:t xml:space="preserve">Hay un solo usuario administrador: la secretaria. Los especialistas no inician sesión.</w:t>
+        <w:t xml:space="preserve">Inician sesión dos perfiles: la secretaria (rol</w:t>
+      </w:r>
+      <w:r>
+        <w:t xml:space="preserve"> </w:t>
+      </w:r>
+      <w:r>
+        <w:rPr>
+          <w:rStyle w:val="VerbatimChar"/>
+        </w:rPr>
+        <w:t xml:space="preserve">administrador</w:t>
+      </w:r>
+      <w:r>
+        <w:t xml:space="preserve">) y la propietaria (rol</w:t>
+      </w:r>
+      <w:r>
+        <w:t xml:space="preserve"> </w:t>
+      </w:r>
+      <w:r>
+        <w:rPr>
+          <w:rStyle w:val="VerbatimChar"/>
+        </w:rPr>
+        <w:t xml:space="preserve">superadmin</w:t>
+      </w:r>
+      <w:r>
+        <w:t xml:space="preserve">, creada solo con</w:t>
+      </w:r>
+      <w:r>
+        <w:t xml:space="preserve"> </w:t>
+      </w:r>
+      <w:r>
+        <w:rPr>
+          <w:rStyle w:val="VerbatimChar"/>
+        </w:rPr>
+        <w:t xml:space="preserve">npm run superadmin</w:t>
+      </w:r>
+      <w:r>
+        <w:t xml:space="preserve">). Los especialistas no inician sesión. Lo que la secretaria pide corregir en la historia clínica o anular en el odontograma queda pendiente hasta que la propietaria lo apruebe; lo que hace la propietaria queda vigente de una vez.</w:t>
       </w:r>
     </w:p>
     <w:tbl>
@@ -862,7 +986,7 @@
               <w:jc w:val="left"/>
             </w:pPr>
             <w:r>
-              <w:t xml:space="preserve">Registrar por nombre, asignar una o varias especialidades, activar o desactivar</w:t>
+              <w:t xml:space="preserve">Ver la lista. Registrarlos, asignarles especialidades, título y foto, y activarlos o desactivarlos es solo de la propietaria (decisión 32)</w:t>
             </w:r>
           </w:p>
         </w:tc>
@@ -992,7 +1116,33 @@
               <w:jc w:val="left"/>
             </w:pPr>
             <w:r>
-              <w:t xml:space="preserve">Ver y agregar entradas; corregir con anotación, sin borrar</w:t>
+              <w:t xml:space="preserve">Ver y agregar entradas; pedir correcciones con anotación, sin borrar (las aprueba la propietaria)</w:t>
+            </w:r>
+          </w:p>
+        </w:tc>
+      </w:tr>
+      <w:tr>
+        <w:tc>
+          <w:tcPr/>
+          <w:p>
+            <w:pPr>
+              <w:pStyle w:val="Compact"/>
+              <w:jc w:val="left"/>
+            </w:pPr>
+            <w:r>
+              <w:t xml:space="preserve">Odontograma</w:t>
+            </w:r>
+          </w:p>
+        </w:tc>
+        <w:tc>
+          <w:tcPr/>
+          <w:p>
+            <w:pPr>
+              <w:pStyle w:val="Compact"/>
+              <w:jc w:val="left"/>
+            </w:pPr>
+            <w:r>
+              <w:t xml:space="preserve">Registrar hallazgos por diente y cara (por hacer o realizado), marcarlos como realizados y pedir su anulación con motivo</w:t>
             </w:r>
           </w:p>
         </w:tc>
@@ -1960,7 +2110,7 @@
         <w:t xml:space="preserve"> </w:t>
       </w:r>
       <w:r>
-        <w:t xml:space="preserve">significa agregar entradas o anotar correcciones; nunca borrar ni sobrescribir (Resolución 1995 de 1999). Solo la secretaria tiene acceso.</w:t>
+        <w:t xml:space="preserve">significa agregar entradas o anotar correcciones; nunca borrar ni sobrescribir (Resolución 1995 de 1999). Solo el personal con sesión (secretaria y propietaria) tiene acceso.</w:t>
       </w:r>
     </w:p>
     <w:p>
@@ -1982,7 +2132,7 @@
         <w:t xml:space="preserve"> </w:t>
       </w:r>
       <w:r>
-        <w:t xml:space="preserve">solo la secretaria tiene; cifradas con bcrypt.</w:t>
+        <w:t xml:space="preserve">solo las tienen la secretaria, la propietaria y los administradores que ella cree; cifradas con bcrypt.</w:t>
       </w:r>
     </w:p>
     <w:p>

</xml_diff>